<commit_message>
feat: Initialize Express.js application with package.json and basic server setup.
</commit_message>
<xml_diff>
--- a/lab05/LeNguyenDuyKhangLab05.docx
+++ b/lab05/LeNguyenDuyKhangLab05.docx
@@ -12,6 +12,28 @@
         <w:rPr>
           <w:lang w:val="en-US"/>
         </w:rPr>
+        <w:t xml:space="preserve">Github: </w:t>
+      </w:r>
+      <w:hyperlink r:id="rId4" w:history="1">
+        <w:r>
+          <w:rPr>
+            <w:rStyle w:val="Hyperlink"/>
+            <w:lang w:val="en-US"/>
+          </w:rPr>
+          <w:t>https://github.com/KaneLovegood/CNM</w:t>
+        </w:r>
+      </w:hyperlink>
+    </w:p>
+    <w:p>
+      <w:pPr>
+        <w:rPr>
+          <w:lang w:val="en-US"/>
+        </w:rPr>
+      </w:pPr>
+      <w:r>
+        <w:rPr>
+          <w:lang w:val="en-US"/>
+        </w:rPr>
         <w:t>Cấu hình docker-compose.yaml</w:t>
       </w:r>
     </w:p>
@@ -22,6 +44,9 @@
         </w:rPr>
       </w:pPr>
       <w:r>
+        <w:rPr>
+          <w:noProof/>
+        </w:rPr>
         <w:drawing>
           <wp:inline distT="0" distB="0" distL="0" distR="0" wp14:anchorId="638CD531" wp14:editId="108888F9">
             <wp:extent cx="5731510" cy="3223895"/>
@@ -35,66 +60,6 @@
                 <pic:pic xmlns:pic="http://schemas.openxmlformats.org/drawingml/2006/picture">
                   <pic:nvPicPr>
                     <pic:cNvPr id="1670066107" name=""/>
-                    <pic:cNvPicPr/>
-                  </pic:nvPicPr>
-                  <pic:blipFill>
-                    <a:blip r:embed="rId4"/>
-                    <a:stretch>
-                      <a:fillRect/>
-                    </a:stretch>
-                  </pic:blipFill>
-                  <pic:spPr>
-                    <a:xfrm>
-                      <a:off x="0" y="0"/>
-                      <a:ext cx="5731510" cy="3223895"/>
-                    </a:xfrm>
-                    <a:prstGeom prst="rect">
-                      <a:avLst/>
-                    </a:prstGeom>
-                  </pic:spPr>
-                </pic:pic>
-              </a:graphicData>
-            </a:graphic>
-          </wp:inline>
-        </w:drawing>
-      </w:r>
-    </w:p>
-    <w:p>
-      <w:pPr>
-        <w:rPr>
-          <w:lang w:val="en-US"/>
-        </w:rPr>
-      </w:pPr>
-      <w:r>
-        <w:rPr>
-          <w:lang w:val="en-US"/>
-        </w:rPr>
-        <w:t>Sau khi chạy file:</w:t>
-      </w:r>
-    </w:p>
-    <w:p>
-      <w:pPr>
-        <w:rPr>
-          <w:lang w:val="en-US"/>
-        </w:rPr>
-      </w:pPr>
-      <w:r>
-        <w:rPr>
-          <w:noProof/>
-        </w:rPr>
-        <w:drawing>
-          <wp:inline distT="0" distB="0" distL="0" distR="0" wp14:anchorId="3BDA58A1" wp14:editId="429E6175">
-            <wp:extent cx="5731510" cy="3223895"/>
-            <wp:effectExtent l="0" t="0" r="2540" b="0"/>
-            <wp:docPr id="1572271263" name="Picture 1"/>
-            <wp:cNvGraphicFramePr>
-              <a:graphicFrameLocks xmlns:a="http://schemas.openxmlformats.org/drawingml/2006/main" noChangeAspect="1"/>
-            </wp:cNvGraphicFramePr>
-            <a:graphic xmlns:a="http://schemas.openxmlformats.org/drawingml/2006/main">
-              <a:graphicData uri="http://schemas.openxmlformats.org/drawingml/2006/picture">
-                <pic:pic xmlns:pic="http://schemas.openxmlformats.org/drawingml/2006/picture">
-                  <pic:nvPicPr>
-                    <pic:cNvPr id="1572271263" name=""/>
                     <pic:cNvPicPr/>
                   </pic:nvPicPr>
                   <pic:blipFill>
@@ -129,7 +94,7 @@
         <w:rPr>
           <w:lang w:val="en-US"/>
         </w:rPr>
-        <w:t>Giao diện quản lý của dynamo admin</w:t>
+        <w:t>Sau khi chạy file:</w:t>
       </w:r>
     </w:p>
     <w:p>
@@ -142,12 +107,11 @@
         <w:rPr>
           <w:noProof/>
         </w:rPr>
-        <w:lastRenderedPageBreak/>
         <w:drawing>
-          <wp:inline distT="0" distB="0" distL="0" distR="0" wp14:anchorId="0CEBE7B3" wp14:editId="3CE8986E">
+          <wp:inline distT="0" distB="0" distL="0" distR="0" wp14:anchorId="3BDA58A1" wp14:editId="429E6175">
             <wp:extent cx="5731510" cy="3223895"/>
             <wp:effectExtent l="0" t="0" r="2540" b="0"/>
-            <wp:docPr id="1954185883" name="Picture 1"/>
+            <wp:docPr id="1572271263" name="Picture 1"/>
             <wp:cNvGraphicFramePr>
               <a:graphicFrameLocks xmlns:a="http://schemas.openxmlformats.org/drawingml/2006/main" noChangeAspect="1"/>
             </wp:cNvGraphicFramePr>
@@ -155,7 +119,7 @@
               <a:graphicData uri="http://schemas.openxmlformats.org/drawingml/2006/picture">
                 <pic:pic xmlns:pic="http://schemas.openxmlformats.org/drawingml/2006/picture">
                   <pic:nvPicPr>
-                    <pic:cNvPr id="1954185883" name=""/>
+                    <pic:cNvPr id="1572271263" name=""/>
                     <pic:cNvPicPr/>
                   </pic:nvPicPr>
                   <pic:blipFill>
@@ -190,24 +154,25 @@
         <w:rPr>
           <w:lang w:val="en-US"/>
         </w:rPr>
-        <w:t>Giao diện danh sách sản phẩm:</w:t>
-      </w:r>
-    </w:p>
-    <w:p>
-      <w:pPr>
-        <w:rPr>
-          <w:lang w:val="en-US"/>
-        </w:rPr>
-      </w:pPr>
-      <w:r>
-        <w:rPr>
-          <w:lang w:val="en-US"/>
-        </w:rPr>
+        <w:t>Giao diện quản lý của dynamo admin</w:t>
+      </w:r>
+    </w:p>
+    <w:p>
+      <w:pPr>
+        <w:rPr>
+          <w:lang w:val="en-US"/>
+        </w:rPr>
+      </w:pPr>
+      <w:r>
+        <w:rPr>
+          <w:noProof/>
+        </w:rPr>
+        <w:lastRenderedPageBreak/>
         <w:drawing>
-          <wp:inline distT="0" distB="0" distL="0" distR="0" wp14:anchorId="6A351CF5" wp14:editId="70316804">
+          <wp:inline distT="0" distB="0" distL="0" distR="0" wp14:anchorId="0CEBE7B3" wp14:editId="3CE8986E">
             <wp:extent cx="5731510" cy="3223895"/>
             <wp:effectExtent l="0" t="0" r="2540" b="0"/>
-            <wp:docPr id="79111640" name="Picture 1"/>
+            <wp:docPr id="1954185883" name="Picture 1"/>
             <wp:cNvGraphicFramePr>
               <a:graphicFrameLocks xmlns:a="http://schemas.openxmlformats.org/drawingml/2006/main" noChangeAspect="1"/>
             </wp:cNvGraphicFramePr>
@@ -215,7 +180,7 @@
               <a:graphicData uri="http://schemas.openxmlformats.org/drawingml/2006/picture">
                 <pic:pic xmlns:pic="http://schemas.openxmlformats.org/drawingml/2006/picture">
                   <pic:nvPicPr>
-                    <pic:cNvPr id="79111640" name=""/>
+                    <pic:cNvPr id="1954185883" name=""/>
                     <pic:cNvPicPr/>
                   </pic:nvPicPr>
                   <pic:blipFill>
@@ -250,25 +215,25 @@
         <w:rPr>
           <w:lang w:val="en-US"/>
         </w:rPr>
-        <w:t>Demo thêm sản phẩm</w:t>
-      </w:r>
-    </w:p>
-    <w:p>
-      <w:pPr>
-        <w:rPr>
-          <w:lang w:val="en-US"/>
-        </w:rPr>
-      </w:pPr>
-      <w:r>
-        <w:rPr>
-          <w:lang w:val="en-US"/>
-        </w:rPr>
-        <w:lastRenderedPageBreak/>
+        <w:t>Giao diện danh sách sản phẩm:</w:t>
+      </w:r>
+    </w:p>
+    <w:p>
+      <w:pPr>
+        <w:rPr>
+          <w:lang w:val="en-US"/>
+        </w:rPr>
+      </w:pPr>
+      <w:r>
+        <w:rPr>
+          <w:noProof/>
+          <w:lang w:val="en-US"/>
+        </w:rPr>
         <w:drawing>
-          <wp:inline distT="0" distB="0" distL="0" distR="0" wp14:anchorId="47D9AB26" wp14:editId="09EF0666">
+          <wp:inline distT="0" distB="0" distL="0" distR="0" wp14:anchorId="6A351CF5" wp14:editId="70316804">
             <wp:extent cx="5731510" cy="3223895"/>
             <wp:effectExtent l="0" t="0" r="2540" b="0"/>
-            <wp:docPr id="332979491" name="Picture 1"/>
+            <wp:docPr id="79111640" name="Picture 1"/>
             <wp:cNvGraphicFramePr>
               <a:graphicFrameLocks xmlns:a="http://schemas.openxmlformats.org/drawingml/2006/main" noChangeAspect="1"/>
             </wp:cNvGraphicFramePr>
@@ -276,7 +241,7 @@
               <a:graphicData uri="http://schemas.openxmlformats.org/drawingml/2006/picture">
                 <pic:pic xmlns:pic="http://schemas.openxmlformats.org/drawingml/2006/picture">
                   <pic:nvPicPr>
-                    <pic:cNvPr id="332979491" name=""/>
+                    <pic:cNvPr id="79111640" name=""/>
                     <pic:cNvPicPr/>
                   </pic:nvPicPr>
                   <pic:blipFill>
@@ -311,24 +276,26 @@
         <w:rPr>
           <w:lang w:val="en-US"/>
         </w:rPr>
-        <w:t>Kết quả sản phẩm hiển thị lên danh sách và dynamodb:</w:t>
-      </w:r>
-    </w:p>
-    <w:p>
-      <w:pPr>
-        <w:rPr>
-          <w:lang w:val="en-US"/>
-        </w:rPr>
-      </w:pPr>
-      <w:r>
-        <w:rPr>
-          <w:lang w:val="en-US"/>
-        </w:rPr>
+        <w:t>Demo thêm sản phẩm</w:t>
+      </w:r>
+    </w:p>
+    <w:p>
+      <w:pPr>
+        <w:rPr>
+          <w:lang w:val="en-US"/>
+        </w:rPr>
+      </w:pPr>
+      <w:r>
+        <w:rPr>
+          <w:noProof/>
+          <w:lang w:val="en-US"/>
+        </w:rPr>
+        <w:lastRenderedPageBreak/>
         <w:drawing>
-          <wp:inline distT="0" distB="0" distL="0" distR="0" wp14:anchorId="701C279F" wp14:editId="4A3319FD">
+          <wp:inline distT="0" distB="0" distL="0" distR="0" wp14:anchorId="47D9AB26" wp14:editId="09EF0666">
             <wp:extent cx="5731510" cy="3223895"/>
             <wp:effectExtent l="0" t="0" r="2540" b="0"/>
-            <wp:docPr id="1812282545" name="Picture 1"/>
+            <wp:docPr id="332979491" name="Picture 1"/>
             <wp:cNvGraphicFramePr>
               <a:graphicFrameLocks xmlns:a="http://schemas.openxmlformats.org/drawingml/2006/main" noChangeAspect="1"/>
             </wp:cNvGraphicFramePr>
@@ -336,7 +303,7 @@
               <a:graphicData uri="http://schemas.openxmlformats.org/drawingml/2006/picture">
                 <pic:pic xmlns:pic="http://schemas.openxmlformats.org/drawingml/2006/picture">
                   <pic:nvPicPr>
-                    <pic:cNvPr id="1812282545" name=""/>
+                    <pic:cNvPr id="332979491" name=""/>
                     <pic:cNvPicPr/>
                   </pic:nvPicPr>
                   <pic:blipFill>
@@ -371,12 +338,25 @@
         <w:rPr>
           <w:lang w:val="en-US"/>
         </w:rPr>
-        <w:lastRenderedPageBreak/>
+        <w:t>Kết quả sản phẩm hiển thị lên danh sách và dynamodb:</w:t>
+      </w:r>
+    </w:p>
+    <w:p>
+      <w:pPr>
+        <w:rPr>
+          <w:lang w:val="en-US"/>
+        </w:rPr>
+      </w:pPr>
+      <w:r>
+        <w:rPr>
+          <w:noProof/>
+          <w:lang w:val="en-US"/>
+        </w:rPr>
         <w:drawing>
-          <wp:inline distT="0" distB="0" distL="0" distR="0" wp14:anchorId="0572BDA0" wp14:editId="00EEC056">
+          <wp:inline distT="0" distB="0" distL="0" distR="0" wp14:anchorId="701C279F" wp14:editId="4A3319FD">
             <wp:extent cx="5731510" cy="3223895"/>
             <wp:effectExtent l="0" t="0" r="2540" b="0"/>
-            <wp:docPr id="1795205286" name="Picture 1"/>
+            <wp:docPr id="1812282545" name="Picture 1"/>
             <wp:cNvGraphicFramePr>
               <a:graphicFrameLocks xmlns:a="http://schemas.openxmlformats.org/drawingml/2006/main" noChangeAspect="1"/>
             </wp:cNvGraphicFramePr>
@@ -384,7 +364,7 @@
               <a:graphicData uri="http://schemas.openxmlformats.org/drawingml/2006/picture">
                 <pic:pic xmlns:pic="http://schemas.openxmlformats.org/drawingml/2006/picture">
                   <pic:nvPicPr>
-                    <pic:cNvPr id="1795205286" name=""/>
+                    <pic:cNvPr id="1812282545" name=""/>
                     <pic:cNvPicPr/>
                   </pic:nvPicPr>
                   <pic:blipFill>
@@ -417,26 +397,15 @@
       </w:pPr>
       <w:r>
         <w:rPr>
-          <w:lang w:val="en-US"/>
-        </w:rPr>
-        <w:t>Demo sửa sản phẩm:</w:t>
-      </w:r>
-    </w:p>
-    <w:p>
-      <w:pPr>
-        <w:rPr>
-          <w:lang w:val="en-US"/>
-        </w:rPr>
-      </w:pPr>
-      <w:r>
-        <w:rPr>
-          <w:lang w:val="en-US"/>
-        </w:rPr>
+          <w:noProof/>
+          <w:lang w:val="en-US"/>
+        </w:rPr>
+        <w:lastRenderedPageBreak/>
         <w:drawing>
-          <wp:inline distT="0" distB="0" distL="0" distR="0" wp14:anchorId="6F768EE6" wp14:editId="37EE5F7E">
+          <wp:inline distT="0" distB="0" distL="0" distR="0" wp14:anchorId="0572BDA0" wp14:editId="00EEC056">
             <wp:extent cx="5731510" cy="3223895"/>
             <wp:effectExtent l="0" t="0" r="2540" b="0"/>
-            <wp:docPr id="957790572" name="Picture 1"/>
+            <wp:docPr id="1795205286" name="Picture 1"/>
             <wp:cNvGraphicFramePr>
               <a:graphicFrameLocks xmlns:a="http://schemas.openxmlformats.org/drawingml/2006/main" noChangeAspect="1"/>
             </wp:cNvGraphicFramePr>
@@ -444,7 +413,7 @@
               <a:graphicData uri="http://schemas.openxmlformats.org/drawingml/2006/picture">
                 <pic:pic xmlns:pic="http://schemas.openxmlformats.org/drawingml/2006/picture">
                   <pic:nvPicPr>
-                    <pic:cNvPr id="957790572" name=""/>
+                    <pic:cNvPr id="1795205286" name=""/>
                     <pic:cNvPicPr/>
                   </pic:nvPicPr>
                   <pic:blipFill>
@@ -479,25 +448,25 @@
         <w:rPr>
           <w:lang w:val="en-US"/>
         </w:rPr>
-        <w:t>Kết quả thông tin mới được cập nhật</w:t>
-      </w:r>
-    </w:p>
-    <w:p>
-      <w:pPr>
-        <w:rPr>
-          <w:lang w:val="en-US"/>
-        </w:rPr>
-      </w:pPr>
-      <w:r>
-        <w:rPr>
-          <w:lang w:val="en-US"/>
-        </w:rPr>
-        <w:lastRenderedPageBreak/>
+        <w:t>Demo sửa sản phẩm:</w:t>
+      </w:r>
+    </w:p>
+    <w:p>
+      <w:pPr>
+        <w:rPr>
+          <w:lang w:val="en-US"/>
+        </w:rPr>
+      </w:pPr>
+      <w:r>
+        <w:rPr>
+          <w:noProof/>
+          <w:lang w:val="en-US"/>
+        </w:rPr>
         <w:drawing>
-          <wp:inline distT="0" distB="0" distL="0" distR="0" wp14:anchorId="46C25A87" wp14:editId="04D02274">
+          <wp:inline distT="0" distB="0" distL="0" distR="0" wp14:anchorId="6F768EE6" wp14:editId="37EE5F7E">
             <wp:extent cx="5731510" cy="3223895"/>
             <wp:effectExtent l="0" t="0" r="2540" b="0"/>
-            <wp:docPr id="618892509" name="Picture 1"/>
+            <wp:docPr id="957790572" name="Picture 1"/>
             <wp:cNvGraphicFramePr>
               <a:graphicFrameLocks xmlns:a="http://schemas.openxmlformats.org/drawingml/2006/main" noChangeAspect="1"/>
             </wp:cNvGraphicFramePr>
@@ -505,7 +474,7 @@
               <a:graphicData uri="http://schemas.openxmlformats.org/drawingml/2006/picture">
                 <pic:pic xmlns:pic="http://schemas.openxmlformats.org/drawingml/2006/picture">
                   <pic:nvPicPr>
-                    <pic:cNvPr id="618892509" name=""/>
+                    <pic:cNvPr id="957790572" name=""/>
                     <pic:cNvPicPr/>
                   </pic:nvPicPr>
                   <pic:blipFill>
@@ -540,11 +509,26 @@
         <w:rPr>
           <w:lang w:val="en-US"/>
         </w:rPr>
+        <w:t>Kết quả thông tin mới được cập nhật</w:t>
+      </w:r>
+    </w:p>
+    <w:p>
+      <w:pPr>
+        <w:rPr>
+          <w:lang w:val="en-US"/>
+        </w:rPr>
+      </w:pPr>
+      <w:r>
+        <w:rPr>
+          <w:noProof/>
+          <w:lang w:val="en-US"/>
+        </w:rPr>
+        <w:lastRenderedPageBreak/>
         <w:drawing>
-          <wp:inline distT="0" distB="0" distL="0" distR="0" wp14:anchorId="1C86AA57" wp14:editId="39576A96">
+          <wp:inline distT="0" distB="0" distL="0" distR="0" wp14:anchorId="46C25A87" wp14:editId="04D02274">
             <wp:extent cx="5731510" cy="3223895"/>
             <wp:effectExtent l="0" t="0" r="2540" b="0"/>
-            <wp:docPr id="1211410549" name="Picture 1"/>
+            <wp:docPr id="618892509" name="Picture 1"/>
             <wp:cNvGraphicFramePr>
               <a:graphicFrameLocks xmlns:a="http://schemas.openxmlformats.org/drawingml/2006/main" noChangeAspect="1"/>
             </wp:cNvGraphicFramePr>
@@ -552,7 +536,7 @@
               <a:graphicData uri="http://schemas.openxmlformats.org/drawingml/2006/picture">
                 <pic:pic xmlns:pic="http://schemas.openxmlformats.org/drawingml/2006/picture">
                   <pic:nvPicPr>
-                    <pic:cNvPr id="1211410549" name=""/>
+                    <pic:cNvPr id="618892509" name=""/>
                     <pic:cNvPicPr/>
                   </pic:nvPicPr>
                   <pic:blipFill>
@@ -585,27 +569,14 @@
       </w:pPr>
       <w:r>
         <w:rPr>
-          <w:lang w:val="en-US"/>
-        </w:rPr>
-        <w:t>Demo xoá sản phẩm</w:t>
-      </w:r>
-    </w:p>
-    <w:p>
-      <w:pPr>
-        <w:rPr>
-          <w:lang w:val="en-US"/>
-        </w:rPr>
-      </w:pPr>
-      <w:r>
-        <w:rPr>
-          <w:lang w:val="en-US"/>
-        </w:rPr>
-        <w:lastRenderedPageBreak/>
+          <w:noProof/>
+          <w:lang w:val="en-US"/>
+        </w:rPr>
         <w:drawing>
-          <wp:inline distT="0" distB="0" distL="0" distR="0" wp14:anchorId="2961E6A7" wp14:editId="6B17EC0D">
+          <wp:inline distT="0" distB="0" distL="0" distR="0" wp14:anchorId="1C86AA57" wp14:editId="39576A96">
             <wp:extent cx="5731510" cy="3223895"/>
             <wp:effectExtent l="0" t="0" r="2540" b="0"/>
-            <wp:docPr id="1342969595" name="Picture 1"/>
+            <wp:docPr id="1211410549" name="Picture 1"/>
             <wp:cNvGraphicFramePr>
               <a:graphicFrameLocks xmlns:a="http://schemas.openxmlformats.org/drawingml/2006/main" noChangeAspect="1"/>
             </wp:cNvGraphicFramePr>
@@ -613,7 +584,7 @@
               <a:graphicData uri="http://schemas.openxmlformats.org/drawingml/2006/picture">
                 <pic:pic xmlns:pic="http://schemas.openxmlformats.org/drawingml/2006/picture">
                   <pic:nvPicPr>
-                    <pic:cNvPr id="1342969595" name=""/>
+                    <pic:cNvPr id="1211410549" name=""/>
                     <pic:cNvPicPr/>
                   </pic:nvPicPr>
                   <pic:blipFill>
@@ -648,24 +619,26 @@
         <w:rPr>
           <w:lang w:val="en-US"/>
         </w:rPr>
-        <w:t>Sản phẩm trong dynamo cũng bị xoá</w:t>
-      </w:r>
-    </w:p>
-    <w:p>
-      <w:pPr>
-        <w:rPr>
-          <w:lang w:val="en-US"/>
-        </w:rPr>
-      </w:pPr>
-      <w:r>
-        <w:rPr>
-          <w:lang w:val="en-US"/>
-        </w:rPr>
+        <w:t>Demo xoá sản phẩm</w:t>
+      </w:r>
+    </w:p>
+    <w:p>
+      <w:pPr>
+        <w:rPr>
+          <w:lang w:val="en-US"/>
+        </w:rPr>
+      </w:pPr>
+      <w:r>
+        <w:rPr>
+          <w:noProof/>
+          <w:lang w:val="en-US"/>
+        </w:rPr>
+        <w:lastRenderedPageBreak/>
         <w:drawing>
-          <wp:inline distT="0" distB="0" distL="0" distR="0" wp14:anchorId="3E694891" wp14:editId="4BC1BF67">
+          <wp:inline distT="0" distB="0" distL="0" distR="0" wp14:anchorId="2961E6A7" wp14:editId="6B17EC0D">
             <wp:extent cx="5731510" cy="3223895"/>
             <wp:effectExtent l="0" t="0" r="2540" b="0"/>
-            <wp:docPr id="1731557064" name="Picture 1"/>
+            <wp:docPr id="1342969595" name="Picture 1"/>
             <wp:cNvGraphicFramePr>
               <a:graphicFrameLocks xmlns:a="http://schemas.openxmlformats.org/drawingml/2006/main" noChangeAspect="1"/>
             </wp:cNvGraphicFramePr>
@@ -673,7 +646,7 @@
               <a:graphicData uri="http://schemas.openxmlformats.org/drawingml/2006/picture">
                 <pic:pic xmlns:pic="http://schemas.openxmlformats.org/drawingml/2006/picture">
                   <pic:nvPicPr>
-                    <pic:cNvPr id="1731557064" name=""/>
+                    <pic:cNvPr id="1342969595" name=""/>
                     <pic:cNvPicPr/>
                   </pic:nvPicPr>
                   <pic:blipFill>
@@ -708,6 +681,67 @@
         <w:rPr>
           <w:lang w:val="en-US"/>
         </w:rPr>
+        <w:t>Sản phẩm trong dynamo cũng bị xoá</w:t>
+      </w:r>
+    </w:p>
+    <w:p>
+      <w:pPr>
+        <w:rPr>
+          <w:lang w:val="en-US"/>
+        </w:rPr>
+      </w:pPr>
+      <w:r>
+        <w:rPr>
+          <w:noProof/>
+          <w:lang w:val="en-US"/>
+        </w:rPr>
+        <w:drawing>
+          <wp:inline distT="0" distB="0" distL="0" distR="0" wp14:anchorId="3E694891" wp14:editId="4BC1BF67">
+            <wp:extent cx="5731510" cy="3223895"/>
+            <wp:effectExtent l="0" t="0" r="2540" b="0"/>
+            <wp:docPr id="1731557064" name="Picture 1"/>
+            <wp:cNvGraphicFramePr>
+              <a:graphicFrameLocks xmlns:a="http://schemas.openxmlformats.org/drawingml/2006/main" noChangeAspect="1"/>
+            </wp:cNvGraphicFramePr>
+            <a:graphic xmlns:a="http://schemas.openxmlformats.org/drawingml/2006/main">
+              <a:graphicData uri="http://schemas.openxmlformats.org/drawingml/2006/picture">
+                <pic:pic xmlns:pic="http://schemas.openxmlformats.org/drawingml/2006/picture">
+                  <pic:nvPicPr>
+                    <pic:cNvPr id="1731557064" name=""/>
+                    <pic:cNvPicPr/>
+                  </pic:nvPicPr>
+                  <pic:blipFill>
+                    <a:blip r:embed="rId16"/>
+                    <a:stretch>
+                      <a:fillRect/>
+                    </a:stretch>
+                  </pic:blipFill>
+                  <pic:spPr>
+                    <a:xfrm>
+                      <a:off x="0" y="0"/>
+                      <a:ext cx="5731510" cy="3223895"/>
+                    </a:xfrm>
+                    <a:prstGeom prst="rect">
+                      <a:avLst/>
+                    </a:prstGeom>
+                  </pic:spPr>
+                </pic:pic>
+              </a:graphicData>
+            </a:graphic>
+          </wp:inline>
+        </w:drawing>
+      </w:r>
+    </w:p>
+    <w:p>
+      <w:pPr>
+        <w:rPr>
+          <w:lang w:val="en-US"/>
+        </w:rPr>
+      </w:pPr>
+      <w:r>
+        <w:rPr>
+          <w:lang w:val="en-US"/>
+        </w:rPr>
         <w:t>Cấu trúc project:</w:t>
       </w:r>
     </w:p>
@@ -719,6 +753,7 @@
       </w:pPr>
       <w:r>
         <w:rPr>
+          <w:noProof/>
           <w:lang w:val="en-US"/>
         </w:rPr>
         <w:lastRenderedPageBreak/>
@@ -738,7 +773,7 @@
                     <pic:cNvPicPr/>
                   </pic:nvPicPr>
                   <pic:blipFill>
-                    <a:blip r:embed="rId16"/>
+                    <a:blip r:embed="rId17"/>
                     <a:stretch>
                       <a:fillRect/>
                     </a:stretch>
@@ -1686,6 +1721,29 @@
       <w:spacing w:val="5"/>
     </w:rPr>
   </w:style>
+  <w:style w:type="character" w:styleId="Hyperlink">
+    <w:name w:val="Hyperlink"/>
+    <w:basedOn w:val="DefaultParagraphFont"/>
+    <w:uiPriority w:val="99"/>
+    <w:unhideWhenUsed/>
+    <w:rsid w:val="002D7B29"/>
+    <w:rPr>
+      <w:color w:val="0563C1" w:themeColor="hyperlink"/>
+      <w:u w:val="single"/>
+    </w:rPr>
+  </w:style>
+  <w:style w:type="character" w:styleId="UnresolvedMention">
+    <w:name w:val="Unresolved Mention"/>
+    <w:basedOn w:val="DefaultParagraphFont"/>
+    <w:uiPriority w:val="99"/>
+    <w:semiHidden/>
+    <w:unhideWhenUsed/>
+    <w:rsid w:val="002D7B29"/>
+    <w:rPr>
+      <w:color w:val="605E5C"/>
+      <w:shd w:val="clear" w:color="auto" w:fill="E1DFDD"/>
+    </w:rPr>
+  </w:style>
 </w:styles>
 </file>
 

</xml_diff>